<commit_message>
Add real dates to schedule and partial delivery date
Co-Authored-By: Claude Sonnet 5.5 <noreply@anthropic.com>
Claude-Session: https://claude.ai/code/session_01Cb9JCnkxhYN3njs8QxNxcM
</commit_message>
<xml_diff>
--- a/docs/entrega-parcial.docx
+++ b/docs/entrega-parcial.docx
@@ -240,7 +240,7 @@
         <w:rPr>
           <w:b/>
         </w:rPr>
-        <w:t>2026</w:t>
+        <w:t>Entrega parcial: 09/10/2026</w:t>
       </w:r>
     </w:p>
     <w:p>
@@ -1301,7 +1301,7 @@
         <w:rPr>
           <w:b w:val="0"/>
         </w:rPr>
-        <w:t>O planejamento das atividades, com as fases e os prazos, foi estruturado em um diagrama de Gantt, apresentado no Apêndice A.</w:t>
+        <w:t>O planejamento das atividades, com as fases e os prazos, foi estruturado em um diagrama de Gantt semanal, apresentado no Apêndice A. A semana 1 (de 02/10/2026 a 09/10/2026) corresponde à elaboração e à entrega parcial (escopo e cronograma), prevista para 09/10/2026. As semanas seguintes (S2 a S6) são uma estimativa para a implantação, os testes e a entrega final, a ser ajustada conforme o calendário da disciplina.</w:t>
       </w:r>
     </w:p>
     <w:p>
@@ -1336,7 +1336,7 @@
       <w:tr>
         <w:tc>
           <w:tcPr>
-            <w:tcW w:type="dxa" w:w="1587"/>
+            <w:tcW w:type="dxa" w:w="1474"/>
             <w:shd w:val="clear" w:fill="D9D9D9"/>
           </w:tcPr>
           <w:p>
@@ -1352,7 +1352,7 @@
         </w:tc>
         <w:tc>
           <w:tcPr>
-            <w:tcW w:type="dxa" w:w="3515"/>
+            <w:tcW w:type="dxa" w:w="3061"/>
             <w:shd w:val="clear" w:fill="D9D9D9"/>
           </w:tcPr>
           <w:p>
@@ -1368,7 +1368,7 @@
         </w:tc>
         <w:tc>
           <w:tcPr>
-            <w:tcW w:type="dxa" w:w="567"/>
+            <w:tcW w:type="dxa" w:w="754"/>
             <w:shd w:val="clear" w:fill="D9D9D9"/>
           </w:tcPr>
           <w:p>
@@ -1379,12 +1379,14 @@
                 <w:sz w:val="18"/>
               </w:rPr>
               <w:t>S1</w:t>
+              <w:br/>
+              <w:t>02/10</w:t>
             </w:r>
           </w:p>
         </w:tc>
         <w:tc>
           <w:tcPr>
-            <w:tcW w:type="dxa" w:w="567"/>
+            <w:tcW w:type="dxa" w:w="754"/>
             <w:shd w:val="clear" w:fill="D9D9D9"/>
           </w:tcPr>
           <w:p>
@@ -1395,12 +1397,14 @@
                 <w:sz w:val="18"/>
               </w:rPr>
               <w:t>S2</w:t>
+              <w:br/>
+              <w:t>09/10</w:t>
             </w:r>
           </w:p>
         </w:tc>
         <w:tc>
           <w:tcPr>
-            <w:tcW w:type="dxa" w:w="567"/>
+            <w:tcW w:type="dxa" w:w="754"/>
             <w:shd w:val="clear" w:fill="D9D9D9"/>
           </w:tcPr>
           <w:p>
@@ -1411,12 +1415,14 @@
                 <w:sz w:val="18"/>
               </w:rPr>
               <w:t>S3</w:t>
+              <w:br/>
+              <w:t>16/10</w:t>
             </w:r>
           </w:p>
         </w:tc>
         <w:tc>
           <w:tcPr>
-            <w:tcW w:type="dxa" w:w="567"/>
+            <w:tcW w:type="dxa" w:w="754"/>
             <w:shd w:val="clear" w:fill="D9D9D9"/>
           </w:tcPr>
           <w:p>
@@ -1427,12 +1433,14 @@
                 <w:sz w:val="18"/>
               </w:rPr>
               <w:t>S4</w:t>
+              <w:br/>
+              <w:t>23/10</w:t>
             </w:r>
           </w:p>
         </w:tc>
         <w:tc>
           <w:tcPr>
-            <w:tcW w:type="dxa" w:w="567"/>
+            <w:tcW w:type="dxa" w:w="754"/>
             <w:shd w:val="clear" w:fill="D9D9D9"/>
           </w:tcPr>
           <w:p>
@@ -1443,12 +1451,14 @@
                 <w:sz w:val="18"/>
               </w:rPr>
               <w:t>S5</w:t>
+              <w:br/>
+              <w:t>30/10</w:t>
             </w:r>
           </w:p>
         </w:tc>
         <w:tc>
           <w:tcPr>
-            <w:tcW w:type="dxa" w:w="567"/>
+            <w:tcW w:type="dxa" w:w="754"/>
             <w:shd w:val="clear" w:fill="D9D9D9"/>
           </w:tcPr>
           <w:p>
@@ -1459,6 +1469,8 @@
                 <w:sz w:val="18"/>
               </w:rPr>
               <w:t>S6</w:t>
+              <w:br/>
+              <w:t>06/11</w:t>
             </w:r>
           </w:p>
         </w:tc>
@@ -1466,7 +1478,7 @@
       <w:tr>
         <w:tc>
           <w:tcPr>
-            <w:tcW w:type="dxa" w:w="1587"/>
+            <w:tcW w:type="dxa" w:w="1474"/>
           </w:tcPr>
           <w:p>
             <w:r/>
@@ -1480,7 +1492,7 @@
         </w:tc>
         <w:tc>
           <w:tcPr>
-            <w:tcW w:type="dxa" w:w="3515"/>
+            <w:tcW w:type="dxa" w:w="3061"/>
           </w:tcPr>
           <w:p>
             <w:r/>
@@ -1494,7 +1506,7 @@
         </w:tc>
         <w:tc>
           <w:tcPr>
-            <w:tcW w:type="dxa" w:w="567"/>
+            <w:tcW w:type="dxa" w:w="754"/>
             <w:shd w:val="clear" w:fill="404040"/>
           </w:tcPr>
           <w:p>
@@ -1508,7 +1520,7 @@
         </w:tc>
         <w:tc>
           <w:tcPr>
-            <w:tcW w:type="dxa" w:w="567"/>
+            <w:tcW w:type="dxa" w:w="754"/>
           </w:tcPr>
           <w:p>
             <w:r/>
@@ -1521,7 +1533,7 @@
         </w:tc>
         <w:tc>
           <w:tcPr>
-            <w:tcW w:type="dxa" w:w="567"/>
+            <w:tcW w:type="dxa" w:w="754"/>
           </w:tcPr>
           <w:p>
             <w:r/>
@@ -1534,7 +1546,7 @@
         </w:tc>
         <w:tc>
           <w:tcPr>
-            <w:tcW w:type="dxa" w:w="567"/>
+            <w:tcW w:type="dxa" w:w="754"/>
           </w:tcPr>
           <w:p>
             <w:r/>
@@ -1547,7 +1559,7 @@
         </w:tc>
         <w:tc>
           <w:tcPr>
-            <w:tcW w:type="dxa" w:w="567"/>
+            <w:tcW w:type="dxa" w:w="754"/>
           </w:tcPr>
           <w:p>
             <w:r/>
@@ -1560,7 +1572,7 @@
         </w:tc>
         <w:tc>
           <w:tcPr>
-            <w:tcW w:type="dxa" w:w="567"/>
+            <w:tcW w:type="dxa" w:w="754"/>
           </w:tcPr>
           <w:p>
             <w:r/>
@@ -1575,7 +1587,7 @@
       <w:tr>
         <w:tc>
           <w:tcPr>
-            <w:tcW w:type="dxa" w:w="1587"/>
+            <w:tcW w:type="dxa" w:w="1474"/>
           </w:tcPr>
           <w:p>
             <w:r/>
@@ -1589,7 +1601,7 @@
         </w:tc>
         <w:tc>
           <w:tcPr>
-            <w:tcW w:type="dxa" w:w="3515"/>
+            <w:tcW w:type="dxa" w:w="3061"/>
           </w:tcPr>
           <w:p>
             <w:r/>
@@ -1603,7 +1615,7 @@
         </w:tc>
         <w:tc>
           <w:tcPr>
-            <w:tcW w:type="dxa" w:w="567"/>
+            <w:tcW w:type="dxa" w:w="754"/>
           </w:tcPr>
           <w:p>
             <w:r/>
@@ -1616,7 +1628,7 @@
         </w:tc>
         <w:tc>
           <w:tcPr>
-            <w:tcW w:type="dxa" w:w="567"/>
+            <w:tcW w:type="dxa" w:w="754"/>
             <w:shd w:val="clear" w:fill="404040"/>
           </w:tcPr>
           <w:p>
@@ -1630,7 +1642,7 @@
         </w:tc>
         <w:tc>
           <w:tcPr>
-            <w:tcW w:type="dxa" w:w="567"/>
+            <w:tcW w:type="dxa" w:w="754"/>
           </w:tcPr>
           <w:p>
             <w:r/>
@@ -1643,7 +1655,7 @@
         </w:tc>
         <w:tc>
           <w:tcPr>
-            <w:tcW w:type="dxa" w:w="567"/>
+            <w:tcW w:type="dxa" w:w="754"/>
           </w:tcPr>
           <w:p>
             <w:r/>
@@ -1656,7 +1668,7 @@
         </w:tc>
         <w:tc>
           <w:tcPr>
-            <w:tcW w:type="dxa" w:w="567"/>
+            <w:tcW w:type="dxa" w:w="754"/>
           </w:tcPr>
           <w:p>
             <w:r/>
@@ -1669,7 +1681,7 @@
         </w:tc>
         <w:tc>
           <w:tcPr>
-            <w:tcW w:type="dxa" w:w="567"/>
+            <w:tcW w:type="dxa" w:w="754"/>
           </w:tcPr>
           <w:p>
             <w:r/>
@@ -1684,7 +1696,7 @@
       <w:tr>
         <w:tc>
           <w:tcPr>
-            <w:tcW w:type="dxa" w:w="1587"/>
+            <w:tcW w:type="dxa" w:w="1474"/>
           </w:tcPr>
           <w:p>
             <w:r/>
@@ -1697,7 +1709,7 @@
         </w:tc>
         <w:tc>
           <w:tcPr>
-            <w:tcW w:type="dxa" w:w="3515"/>
+            <w:tcW w:type="dxa" w:w="3061"/>
           </w:tcPr>
           <w:p>
             <w:r/>
@@ -1711,7 +1723,7 @@
         </w:tc>
         <w:tc>
           <w:tcPr>
-            <w:tcW w:type="dxa" w:w="567"/>
+            <w:tcW w:type="dxa" w:w="754"/>
           </w:tcPr>
           <w:p>
             <w:r/>
@@ -1724,7 +1736,7 @@
         </w:tc>
         <w:tc>
           <w:tcPr>
-            <w:tcW w:type="dxa" w:w="567"/>
+            <w:tcW w:type="dxa" w:w="754"/>
             <w:shd w:val="clear" w:fill="404040"/>
           </w:tcPr>
           <w:p>
@@ -1738,7 +1750,7 @@
         </w:tc>
         <w:tc>
           <w:tcPr>
-            <w:tcW w:type="dxa" w:w="567"/>
+            <w:tcW w:type="dxa" w:w="754"/>
             <w:shd w:val="clear" w:fill="404040"/>
           </w:tcPr>
           <w:p>
@@ -1752,7 +1764,7 @@
         </w:tc>
         <w:tc>
           <w:tcPr>
-            <w:tcW w:type="dxa" w:w="567"/>
+            <w:tcW w:type="dxa" w:w="754"/>
           </w:tcPr>
           <w:p>
             <w:r/>
@@ -1765,7 +1777,7 @@
         </w:tc>
         <w:tc>
           <w:tcPr>
-            <w:tcW w:type="dxa" w:w="567"/>
+            <w:tcW w:type="dxa" w:w="754"/>
           </w:tcPr>
           <w:p>
             <w:r/>
@@ -1778,7 +1790,7 @@
         </w:tc>
         <w:tc>
           <w:tcPr>
-            <w:tcW w:type="dxa" w:w="567"/>
+            <w:tcW w:type="dxa" w:w="754"/>
           </w:tcPr>
           <w:p>
             <w:r/>
@@ -1793,7 +1805,7 @@
       <w:tr>
         <w:tc>
           <w:tcPr>
-            <w:tcW w:type="dxa" w:w="1587"/>
+            <w:tcW w:type="dxa" w:w="1474"/>
           </w:tcPr>
           <w:p>
             <w:r/>
@@ -1807,7 +1819,7 @@
         </w:tc>
         <w:tc>
           <w:tcPr>
-            <w:tcW w:type="dxa" w:w="3515"/>
+            <w:tcW w:type="dxa" w:w="3061"/>
           </w:tcPr>
           <w:p>
             <w:r/>
@@ -1821,7 +1833,7 @@
         </w:tc>
         <w:tc>
           <w:tcPr>
-            <w:tcW w:type="dxa" w:w="567"/>
+            <w:tcW w:type="dxa" w:w="754"/>
           </w:tcPr>
           <w:p>
             <w:r/>
@@ -1834,7 +1846,7 @@
         </w:tc>
         <w:tc>
           <w:tcPr>
-            <w:tcW w:type="dxa" w:w="567"/>
+            <w:tcW w:type="dxa" w:w="754"/>
           </w:tcPr>
           <w:p>
             <w:r/>
@@ -1847,7 +1859,7 @@
         </w:tc>
         <w:tc>
           <w:tcPr>
-            <w:tcW w:type="dxa" w:w="567"/>
+            <w:tcW w:type="dxa" w:w="754"/>
             <w:shd w:val="clear" w:fill="404040"/>
           </w:tcPr>
           <w:p>
@@ -1861,7 +1873,7 @@
         </w:tc>
         <w:tc>
           <w:tcPr>
-            <w:tcW w:type="dxa" w:w="567"/>
+            <w:tcW w:type="dxa" w:w="754"/>
           </w:tcPr>
           <w:p>
             <w:r/>
@@ -1874,7 +1886,7 @@
         </w:tc>
         <w:tc>
           <w:tcPr>
-            <w:tcW w:type="dxa" w:w="567"/>
+            <w:tcW w:type="dxa" w:w="754"/>
           </w:tcPr>
           <w:p>
             <w:r/>
@@ -1887,7 +1899,7 @@
         </w:tc>
         <w:tc>
           <w:tcPr>
-            <w:tcW w:type="dxa" w:w="567"/>
+            <w:tcW w:type="dxa" w:w="754"/>
           </w:tcPr>
           <w:p>
             <w:r/>
@@ -1902,7 +1914,7 @@
       <w:tr>
         <w:tc>
           <w:tcPr>
-            <w:tcW w:type="dxa" w:w="1587"/>
+            <w:tcW w:type="dxa" w:w="1474"/>
           </w:tcPr>
           <w:p>
             <w:r/>
@@ -1915,7 +1927,7 @@
         </w:tc>
         <w:tc>
           <w:tcPr>
-            <w:tcW w:type="dxa" w:w="3515"/>
+            <w:tcW w:type="dxa" w:w="3061"/>
           </w:tcPr>
           <w:p>
             <w:r/>
@@ -1929,7 +1941,7 @@
         </w:tc>
         <w:tc>
           <w:tcPr>
-            <w:tcW w:type="dxa" w:w="567"/>
+            <w:tcW w:type="dxa" w:w="754"/>
           </w:tcPr>
           <w:p>
             <w:r/>
@@ -1942,7 +1954,7 @@
         </w:tc>
         <w:tc>
           <w:tcPr>
-            <w:tcW w:type="dxa" w:w="567"/>
+            <w:tcW w:type="dxa" w:w="754"/>
           </w:tcPr>
           <w:p>
             <w:r/>
@@ -1955,7 +1967,7 @@
         </w:tc>
         <w:tc>
           <w:tcPr>
-            <w:tcW w:type="dxa" w:w="567"/>
+            <w:tcW w:type="dxa" w:w="754"/>
             <w:shd w:val="clear" w:fill="404040"/>
           </w:tcPr>
           <w:p>
@@ -1969,7 +1981,7 @@
         </w:tc>
         <w:tc>
           <w:tcPr>
-            <w:tcW w:type="dxa" w:w="567"/>
+            <w:tcW w:type="dxa" w:w="754"/>
             <w:shd w:val="clear" w:fill="404040"/>
           </w:tcPr>
           <w:p>
@@ -1983,7 +1995,7 @@
         </w:tc>
         <w:tc>
           <w:tcPr>
-            <w:tcW w:type="dxa" w:w="567"/>
+            <w:tcW w:type="dxa" w:w="754"/>
           </w:tcPr>
           <w:p>
             <w:r/>
@@ -1996,7 +2008,7 @@
         </w:tc>
         <w:tc>
           <w:tcPr>
-            <w:tcW w:type="dxa" w:w="567"/>
+            <w:tcW w:type="dxa" w:w="754"/>
           </w:tcPr>
           <w:p>
             <w:r/>
@@ -2011,7 +2023,7 @@
       <w:tr>
         <w:tc>
           <w:tcPr>
-            <w:tcW w:type="dxa" w:w="1587"/>
+            <w:tcW w:type="dxa" w:w="1474"/>
           </w:tcPr>
           <w:p>
             <w:r/>
@@ -2024,7 +2036,7 @@
         </w:tc>
         <w:tc>
           <w:tcPr>
-            <w:tcW w:type="dxa" w:w="3515"/>
+            <w:tcW w:type="dxa" w:w="3061"/>
           </w:tcPr>
           <w:p>
             <w:r/>
@@ -2038,7 +2050,7 @@
         </w:tc>
         <w:tc>
           <w:tcPr>
-            <w:tcW w:type="dxa" w:w="567"/>
+            <w:tcW w:type="dxa" w:w="754"/>
           </w:tcPr>
           <w:p>
             <w:r/>
@@ -2051,7 +2063,7 @@
         </w:tc>
         <w:tc>
           <w:tcPr>
-            <w:tcW w:type="dxa" w:w="567"/>
+            <w:tcW w:type="dxa" w:w="754"/>
           </w:tcPr>
           <w:p>
             <w:r/>
@@ -2064,7 +2076,7 @@
         </w:tc>
         <w:tc>
           <w:tcPr>
-            <w:tcW w:type="dxa" w:w="567"/>
+            <w:tcW w:type="dxa" w:w="754"/>
           </w:tcPr>
           <w:p>
             <w:r/>
@@ -2077,7 +2089,7 @@
         </w:tc>
         <w:tc>
           <w:tcPr>
-            <w:tcW w:type="dxa" w:w="567"/>
+            <w:tcW w:type="dxa" w:w="754"/>
             <w:shd w:val="clear" w:fill="404040"/>
           </w:tcPr>
           <w:p>
@@ -2091,7 +2103,7 @@
         </w:tc>
         <w:tc>
           <w:tcPr>
-            <w:tcW w:type="dxa" w:w="567"/>
+            <w:tcW w:type="dxa" w:w="754"/>
           </w:tcPr>
           <w:p>
             <w:r/>
@@ -2104,7 +2116,7 @@
         </w:tc>
         <w:tc>
           <w:tcPr>
-            <w:tcW w:type="dxa" w:w="567"/>
+            <w:tcW w:type="dxa" w:w="754"/>
           </w:tcPr>
           <w:p>
             <w:r/>
@@ -2119,7 +2131,7 @@
       <w:tr>
         <w:tc>
           <w:tcPr>
-            <w:tcW w:type="dxa" w:w="1587"/>
+            <w:tcW w:type="dxa" w:w="1474"/>
           </w:tcPr>
           <w:p>
             <w:r/>
@@ -2133,7 +2145,7 @@
         </w:tc>
         <w:tc>
           <w:tcPr>
-            <w:tcW w:type="dxa" w:w="3515"/>
+            <w:tcW w:type="dxa" w:w="3061"/>
           </w:tcPr>
           <w:p>
             <w:r/>
@@ -2147,7 +2159,7 @@
         </w:tc>
         <w:tc>
           <w:tcPr>
-            <w:tcW w:type="dxa" w:w="567"/>
+            <w:tcW w:type="dxa" w:w="754"/>
           </w:tcPr>
           <w:p>
             <w:r/>
@@ -2160,7 +2172,7 @@
         </w:tc>
         <w:tc>
           <w:tcPr>
-            <w:tcW w:type="dxa" w:w="567"/>
+            <w:tcW w:type="dxa" w:w="754"/>
           </w:tcPr>
           <w:p>
             <w:r/>
@@ -2173,7 +2185,7 @@
         </w:tc>
         <w:tc>
           <w:tcPr>
-            <w:tcW w:type="dxa" w:w="567"/>
+            <w:tcW w:type="dxa" w:w="754"/>
           </w:tcPr>
           <w:p>
             <w:r/>
@@ -2186,7 +2198,7 @@
         </w:tc>
         <w:tc>
           <w:tcPr>
-            <w:tcW w:type="dxa" w:w="567"/>
+            <w:tcW w:type="dxa" w:w="754"/>
             <w:shd w:val="clear" w:fill="404040"/>
           </w:tcPr>
           <w:p>
@@ -2200,7 +2212,7 @@
         </w:tc>
         <w:tc>
           <w:tcPr>
-            <w:tcW w:type="dxa" w:w="567"/>
+            <w:tcW w:type="dxa" w:w="754"/>
           </w:tcPr>
           <w:p>
             <w:r/>
@@ -2213,7 +2225,7 @@
         </w:tc>
         <w:tc>
           <w:tcPr>
-            <w:tcW w:type="dxa" w:w="567"/>
+            <w:tcW w:type="dxa" w:w="754"/>
           </w:tcPr>
           <w:p>
             <w:r/>
@@ -2228,7 +2240,7 @@
       <w:tr>
         <w:tc>
           <w:tcPr>
-            <w:tcW w:type="dxa" w:w="1587"/>
+            <w:tcW w:type="dxa" w:w="1474"/>
           </w:tcPr>
           <w:p>
             <w:r/>
@@ -2241,7 +2253,7 @@
         </w:tc>
         <w:tc>
           <w:tcPr>
-            <w:tcW w:type="dxa" w:w="3515"/>
+            <w:tcW w:type="dxa" w:w="3061"/>
           </w:tcPr>
           <w:p>
             <w:r/>
@@ -2255,7 +2267,7 @@
         </w:tc>
         <w:tc>
           <w:tcPr>
-            <w:tcW w:type="dxa" w:w="567"/>
+            <w:tcW w:type="dxa" w:w="754"/>
           </w:tcPr>
           <w:p>
             <w:r/>
@@ -2268,7 +2280,7 @@
         </w:tc>
         <w:tc>
           <w:tcPr>
-            <w:tcW w:type="dxa" w:w="567"/>
+            <w:tcW w:type="dxa" w:w="754"/>
           </w:tcPr>
           <w:p>
             <w:r/>
@@ -2281,7 +2293,7 @@
         </w:tc>
         <w:tc>
           <w:tcPr>
-            <w:tcW w:type="dxa" w:w="567"/>
+            <w:tcW w:type="dxa" w:w="754"/>
           </w:tcPr>
           <w:p>
             <w:r/>
@@ -2294,7 +2306,7 @@
         </w:tc>
         <w:tc>
           <w:tcPr>
-            <w:tcW w:type="dxa" w:w="567"/>
+            <w:tcW w:type="dxa" w:w="754"/>
           </w:tcPr>
           <w:p>
             <w:r/>
@@ -2307,7 +2319,7 @@
         </w:tc>
         <w:tc>
           <w:tcPr>
-            <w:tcW w:type="dxa" w:w="567"/>
+            <w:tcW w:type="dxa" w:w="754"/>
             <w:shd w:val="clear" w:fill="404040"/>
           </w:tcPr>
           <w:p>
@@ -2321,7 +2333,7 @@
         </w:tc>
         <w:tc>
           <w:tcPr>
-            <w:tcW w:type="dxa" w:w="567"/>
+            <w:tcW w:type="dxa" w:w="754"/>
           </w:tcPr>
           <w:p>
             <w:r/>
@@ -2336,7 +2348,7 @@
       <w:tr>
         <w:tc>
           <w:tcPr>
-            <w:tcW w:type="dxa" w:w="1587"/>
+            <w:tcW w:type="dxa" w:w="1474"/>
           </w:tcPr>
           <w:p>
             <w:r/>
@@ -2350,7 +2362,7 @@
         </w:tc>
         <w:tc>
           <w:tcPr>
-            <w:tcW w:type="dxa" w:w="3515"/>
+            <w:tcW w:type="dxa" w:w="3061"/>
           </w:tcPr>
           <w:p>
             <w:r/>
@@ -2364,7 +2376,7 @@
         </w:tc>
         <w:tc>
           <w:tcPr>
-            <w:tcW w:type="dxa" w:w="567"/>
+            <w:tcW w:type="dxa" w:w="754"/>
           </w:tcPr>
           <w:p>
             <w:r/>
@@ -2377,7 +2389,7 @@
         </w:tc>
         <w:tc>
           <w:tcPr>
-            <w:tcW w:type="dxa" w:w="567"/>
+            <w:tcW w:type="dxa" w:w="754"/>
           </w:tcPr>
           <w:p>
             <w:r/>
@@ -2390,7 +2402,7 @@
         </w:tc>
         <w:tc>
           <w:tcPr>
-            <w:tcW w:type="dxa" w:w="567"/>
+            <w:tcW w:type="dxa" w:w="754"/>
           </w:tcPr>
           <w:p>
             <w:r/>
@@ -2403,7 +2415,7 @@
         </w:tc>
         <w:tc>
           <w:tcPr>
-            <w:tcW w:type="dxa" w:w="567"/>
+            <w:tcW w:type="dxa" w:w="754"/>
           </w:tcPr>
           <w:p>
             <w:r/>
@@ -2416,7 +2428,7 @@
         </w:tc>
         <w:tc>
           <w:tcPr>
-            <w:tcW w:type="dxa" w:w="567"/>
+            <w:tcW w:type="dxa" w:w="754"/>
             <w:shd w:val="clear" w:fill="404040"/>
           </w:tcPr>
           <w:p>
@@ -2430,7 +2442,7 @@
         </w:tc>
         <w:tc>
           <w:tcPr>
-            <w:tcW w:type="dxa" w:w="567"/>
+            <w:tcW w:type="dxa" w:w="754"/>
           </w:tcPr>
           <w:p>
             <w:r/>
@@ -2445,7 +2457,7 @@
       <w:tr>
         <w:tc>
           <w:tcPr>
-            <w:tcW w:type="dxa" w:w="1587"/>
+            <w:tcW w:type="dxa" w:w="1474"/>
           </w:tcPr>
           <w:p>
             <w:r/>
@@ -2459,7 +2471,7 @@
         </w:tc>
         <w:tc>
           <w:tcPr>
-            <w:tcW w:type="dxa" w:w="3515"/>
+            <w:tcW w:type="dxa" w:w="3061"/>
           </w:tcPr>
           <w:p>
             <w:r/>
@@ -2473,7 +2485,7 @@
         </w:tc>
         <w:tc>
           <w:tcPr>
-            <w:tcW w:type="dxa" w:w="567"/>
+            <w:tcW w:type="dxa" w:w="754"/>
           </w:tcPr>
           <w:p>
             <w:r/>
@@ -2486,7 +2498,7 @@
         </w:tc>
         <w:tc>
           <w:tcPr>
-            <w:tcW w:type="dxa" w:w="567"/>
+            <w:tcW w:type="dxa" w:w="754"/>
           </w:tcPr>
           <w:p>
             <w:r/>
@@ -2499,7 +2511,7 @@
         </w:tc>
         <w:tc>
           <w:tcPr>
-            <w:tcW w:type="dxa" w:w="567"/>
+            <w:tcW w:type="dxa" w:w="754"/>
           </w:tcPr>
           <w:p>
             <w:r/>
@@ -2512,7 +2524,7 @@
         </w:tc>
         <w:tc>
           <w:tcPr>
-            <w:tcW w:type="dxa" w:w="567"/>
+            <w:tcW w:type="dxa" w:w="754"/>
           </w:tcPr>
           <w:p>
             <w:r/>
@@ -2525,7 +2537,7 @@
         </w:tc>
         <w:tc>
           <w:tcPr>
-            <w:tcW w:type="dxa" w:w="567"/>
+            <w:tcW w:type="dxa" w:w="754"/>
             <w:shd w:val="clear" w:fill="404040"/>
           </w:tcPr>
           <w:p>
@@ -2539,7 +2551,7 @@
         </w:tc>
         <w:tc>
           <w:tcPr>
-            <w:tcW w:type="dxa" w:w="567"/>
+            <w:tcW w:type="dxa" w:w="754"/>
             <w:shd w:val="clear" w:fill="404040"/>
           </w:tcPr>
           <w:p>

</xml_diff>

<commit_message>
Extend schedule to final delivery with buffer before 22/11
Co-Authored-By: Claude Sonnet 5.5 <noreply@anthropic.com>
Claude-Session: https://claude.ai/code/session_01Cb9JCnkxhYN3njs8QxNxcM
</commit_message>
<xml_diff>
--- a/docs/entrega-parcial.docx
+++ b/docs/entrega-parcial.docx
@@ -1324,14 +1324,15 @@
         <w:tblLook w:firstColumn="1" w:firstRow="1" w:lastColumn="0" w:lastRow="0" w:noHBand="0" w:noVBand="1" w:val="04A0"/>
       </w:tblPr>
       <w:tblGrid>
-        <w:gridCol w:w="1134"/>
-        <w:gridCol w:w="1134"/>
-        <w:gridCol w:w="1134"/>
-        <w:gridCol w:w="1134"/>
-        <w:gridCol w:w="1134"/>
-        <w:gridCol w:w="1134"/>
-        <w:gridCol w:w="1134"/>
-        <w:gridCol w:w="1134"/>
+        <w:gridCol w:w="1008"/>
+        <w:gridCol w:w="1008"/>
+        <w:gridCol w:w="1008"/>
+        <w:gridCol w:w="1008"/>
+        <w:gridCol w:w="1008"/>
+        <w:gridCol w:w="1008"/>
+        <w:gridCol w:w="1008"/>
+        <w:gridCol w:w="1008"/>
+        <w:gridCol w:w="1008"/>
       </w:tblGrid>
       <w:tr>
         <w:tc>
@@ -1352,7 +1353,7 @@
         </w:tc>
         <w:tc>
           <w:tcPr>
-            <w:tcW w:type="dxa" w:w="3061"/>
+            <w:tcW w:type="dxa" w:w="2835"/>
             <w:shd w:val="clear" w:fill="D9D9D9"/>
           </w:tcPr>
           <w:p>
@@ -1368,7 +1369,7 @@
         </w:tc>
         <w:tc>
           <w:tcPr>
-            <w:tcW w:type="dxa" w:w="754"/>
+            <w:tcW w:type="dxa" w:w="680"/>
             <w:shd w:val="clear" w:fill="D9D9D9"/>
           </w:tcPr>
           <w:p>
@@ -1386,7 +1387,7 @@
         </w:tc>
         <w:tc>
           <w:tcPr>
-            <w:tcW w:type="dxa" w:w="754"/>
+            <w:tcW w:type="dxa" w:w="680"/>
             <w:shd w:val="clear" w:fill="D9D9D9"/>
           </w:tcPr>
           <w:p>
@@ -1404,7 +1405,7 @@
         </w:tc>
         <w:tc>
           <w:tcPr>
-            <w:tcW w:type="dxa" w:w="754"/>
+            <w:tcW w:type="dxa" w:w="680"/>
             <w:shd w:val="clear" w:fill="D9D9D9"/>
           </w:tcPr>
           <w:p>
@@ -1422,7 +1423,7 @@
         </w:tc>
         <w:tc>
           <w:tcPr>
-            <w:tcW w:type="dxa" w:w="754"/>
+            <w:tcW w:type="dxa" w:w="680"/>
             <w:shd w:val="clear" w:fill="D9D9D9"/>
           </w:tcPr>
           <w:p>
@@ -1440,7 +1441,7 @@
         </w:tc>
         <w:tc>
           <w:tcPr>
-            <w:tcW w:type="dxa" w:w="754"/>
+            <w:tcW w:type="dxa" w:w="680"/>
             <w:shd w:val="clear" w:fill="D9D9D9"/>
           </w:tcPr>
           <w:p>
@@ -1458,7 +1459,7 @@
         </w:tc>
         <w:tc>
           <w:tcPr>
-            <w:tcW w:type="dxa" w:w="754"/>
+            <w:tcW w:type="dxa" w:w="680"/>
             <w:shd w:val="clear" w:fill="D9D9D9"/>
           </w:tcPr>
           <w:p>
@@ -1471,6 +1472,24 @@
               <w:t>S6</w:t>
               <w:br/>
               <w:t>06/11</w:t>
+            </w:r>
+          </w:p>
+        </w:tc>
+        <w:tc>
+          <w:tcPr>
+            <w:tcW w:type="dxa" w:w="680"/>
+            <w:shd w:val="clear" w:fill="D9D9D9"/>
+          </w:tcPr>
+          <w:p>
+            <w:r/>
+            <w:r>
+              <w:rPr>
+                <w:b/>
+                <w:sz w:val="18"/>
+              </w:rPr>
+              <w:t>S7</w:t>
+              <w:br/>
+              <w:t>13/11</w:t>
             </w:r>
           </w:p>
         </w:tc>
@@ -1492,7 +1511,7 @@
         </w:tc>
         <w:tc>
           <w:tcPr>
-            <w:tcW w:type="dxa" w:w="3061"/>
+            <w:tcW w:type="dxa" w:w="2835"/>
           </w:tcPr>
           <w:p>
             <w:r/>
@@ -1500,13 +1519,13 @@
               <w:rPr>
                 <w:sz w:val="18"/>
               </w:rPr>
-              <w:t>Escopo, requisitos e desenho da arquitetura</w:t>
+              <w:t>Escopo, requisitos, arquitetura e entrega parcial (09/10)</w:t>
             </w:r>
           </w:p>
         </w:tc>
         <w:tc>
           <w:tcPr>
-            <w:tcW w:type="dxa" w:w="754"/>
+            <w:tcW w:type="dxa" w:w="680"/>
             <w:shd w:val="clear" w:fill="404040"/>
           </w:tcPr>
           <w:p>
@@ -1520,7 +1539,7 @@
         </w:tc>
         <w:tc>
           <w:tcPr>
-            <w:tcW w:type="dxa" w:w="754"/>
+            <w:tcW w:type="dxa" w:w="680"/>
           </w:tcPr>
           <w:p>
             <w:r/>
@@ -1533,7 +1552,7 @@
         </w:tc>
         <w:tc>
           <w:tcPr>
-            <w:tcW w:type="dxa" w:w="754"/>
+            <w:tcW w:type="dxa" w:w="680"/>
           </w:tcPr>
           <w:p>
             <w:r/>
@@ -1546,7 +1565,7 @@
         </w:tc>
         <w:tc>
           <w:tcPr>
-            <w:tcW w:type="dxa" w:w="754"/>
+            <w:tcW w:type="dxa" w:w="680"/>
           </w:tcPr>
           <w:p>
             <w:r/>
@@ -1559,7 +1578,7 @@
         </w:tc>
         <w:tc>
           <w:tcPr>
-            <w:tcW w:type="dxa" w:w="754"/>
+            <w:tcW w:type="dxa" w:w="680"/>
           </w:tcPr>
           <w:p>
             <w:r/>
@@ -1572,7 +1591,20 @@
         </w:tc>
         <w:tc>
           <w:tcPr>
-            <w:tcW w:type="dxa" w:w="754"/>
+            <w:tcW w:type="dxa" w:w="680"/>
+          </w:tcPr>
+          <w:p>
+            <w:r/>
+            <w:r>
+              <w:rPr>
+                <w:sz w:val="18"/>
+              </w:rPr>
+            </w:r>
+          </w:p>
+        </w:tc>
+        <w:tc>
+          <w:tcPr>
+            <w:tcW w:type="dxa" w:w="680"/>
           </w:tcPr>
           <w:p>
             <w:r/>
@@ -1601,7 +1633,7 @@
         </w:tc>
         <w:tc>
           <w:tcPr>
-            <w:tcW w:type="dxa" w:w="3061"/>
+            <w:tcW w:type="dxa" w:w="2835"/>
           </w:tcPr>
           <w:p>
             <w:r/>
@@ -1615,7 +1647,7 @@
         </w:tc>
         <w:tc>
           <w:tcPr>
-            <w:tcW w:type="dxa" w:w="754"/>
+            <w:tcW w:type="dxa" w:w="680"/>
           </w:tcPr>
           <w:p>
             <w:r/>
@@ -1628,7 +1660,7 @@
         </w:tc>
         <w:tc>
           <w:tcPr>
-            <w:tcW w:type="dxa" w:w="754"/>
+            <w:tcW w:type="dxa" w:w="680"/>
             <w:shd w:val="clear" w:fill="404040"/>
           </w:tcPr>
           <w:p>
@@ -1642,7 +1674,7 @@
         </w:tc>
         <w:tc>
           <w:tcPr>
-            <w:tcW w:type="dxa" w:w="754"/>
+            <w:tcW w:type="dxa" w:w="680"/>
           </w:tcPr>
           <w:p>
             <w:r/>
@@ -1655,7 +1687,7 @@
         </w:tc>
         <w:tc>
           <w:tcPr>
-            <w:tcW w:type="dxa" w:w="754"/>
+            <w:tcW w:type="dxa" w:w="680"/>
           </w:tcPr>
           <w:p>
             <w:r/>
@@ -1668,7 +1700,7 @@
         </w:tc>
         <w:tc>
           <w:tcPr>
-            <w:tcW w:type="dxa" w:w="754"/>
+            <w:tcW w:type="dxa" w:w="680"/>
           </w:tcPr>
           <w:p>
             <w:r/>
@@ -1681,7 +1713,20 @@
         </w:tc>
         <w:tc>
           <w:tcPr>
-            <w:tcW w:type="dxa" w:w="754"/>
+            <w:tcW w:type="dxa" w:w="680"/>
+          </w:tcPr>
+          <w:p>
+            <w:r/>
+            <w:r>
+              <w:rPr>
+                <w:sz w:val="18"/>
+              </w:rPr>
+            </w:r>
+          </w:p>
+        </w:tc>
+        <w:tc>
+          <w:tcPr>
+            <w:tcW w:type="dxa" w:w="680"/>
           </w:tcPr>
           <w:p>
             <w:r/>
@@ -1709,7 +1754,7 @@
         </w:tc>
         <w:tc>
           <w:tcPr>
-            <w:tcW w:type="dxa" w:w="3061"/>
+            <w:tcW w:type="dxa" w:w="2835"/>
           </w:tcPr>
           <w:p>
             <w:r/>
@@ -1723,7 +1768,7 @@
         </w:tc>
         <w:tc>
           <w:tcPr>
-            <w:tcW w:type="dxa" w:w="754"/>
+            <w:tcW w:type="dxa" w:w="680"/>
           </w:tcPr>
           <w:p>
             <w:r/>
@@ -1736,7 +1781,7 @@
         </w:tc>
         <w:tc>
           <w:tcPr>
-            <w:tcW w:type="dxa" w:w="754"/>
+            <w:tcW w:type="dxa" w:w="680"/>
             <w:shd w:val="clear" w:fill="404040"/>
           </w:tcPr>
           <w:p>
@@ -1750,7 +1795,7 @@
         </w:tc>
         <w:tc>
           <w:tcPr>
-            <w:tcW w:type="dxa" w:w="754"/>
+            <w:tcW w:type="dxa" w:w="680"/>
             <w:shd w:val="clear" w:fill="404040"/>
           </w:tcPr>
           <w:p>
@@ -1764,7 +1809,7 @@
         </w:tc>
         <w:tc>
           <w:tcPr>
-            <w:tcW w:type="dxa" w:w="754"/>
+            <w:tcW w:type="dxa" w:w="680"/>
           </w:tcPr>
           <w:p>
             <w:r/>
@@ -1777,7 +1822,7 @@
         </w:tc>
         <w:tc>
           <w:tcPr>
-            <w:tcW w:type="dxa" w:w="754"/>
+            <w:tcW w:type="dxa" w:w="680"/>
           </w:tcPr>
           <w:p>
             <w:r/>
@@ -1790,7 +1835,20 @@
         </w:tc>
         <w:tc>
           <w:tcPr>
-            <w:tcW w:type="dxa" w:w="754"/>
+            <w:tcW w:type="dxa" w:w="680"/>
+          </w:tcPr>
+          <w:p>
+            <w:r/>
+            <w:r>
+              <w:rPr>
+                <w:sz w:val="18"/>
+              </w:rPr>
+            </w:r>
+          </w:p>
+        </w:tc>
+        <w:tc>
+          <w:tcPr>
+            <w:tcW w:type="dxa" w:w="680"/>
           </w:tcPr>
           <w:p>
             <w:r/>
@@ -1819,7 +1877,7 @@
         </w:tc>
         <w:tc>
           <w:tcPr>
-            <w:tcW w:type="dxa" w:w="3061"/>
+            <w:tcW w:type="dxa" w:w="2835"/>
           </w:tcPr>
           <w:p>
             <w:r/>
@@ -1833,7 +1891,7 @@
         </w:tc>
         <w:tc>
           <w:tcPr>
-            <w:tcW w:type="dxa" w:w="754"/>
+            <w:tcW w:type="dxa" w:w="680"/>
           </w:tcPr>
           <w:p>
             <w:r/>
@@ -1846,7 +1904,7 @@
         </w:tc>
         <w:tc>
           <w:tcPr>
-            <w:tcW w:type="dxa" w:w="754"/>
+            <w:tcW w:type="dxa" w:w="680"/>
           </w:tcPr>
           <w:p>
             <w:r/>
@@ -1859,7 +1917,7 @@
         </w:tc>
         <w:tc>
           <w:tcPr>
-            <w:tcW w:type="dxa" w:w="754"/>
+            <w:tcW w:type="dxa" w:w="680"/>
             <w:shd w:val="clear" w:fill="404040"/>
           </w:tcPr>
           <w:p>
@@ -1873,7 +1931,7 @@
         </w:tc>
         <w:tc>
           <w:tcPr>
-            <w:tcW w:type="dxa" w:w="754"/>
+            <w:tcW w:type="dxa" w:w="680"/>
           </w:tcPr>
           <w:p>
             <w:r/>
@@ -1886,7 +1944,7 @@
         </w:tc>
         <w:tc>
           <w:tcPr>
-            <w:tcW w:type="dxa" w:w="754"/>
+            <w:tcW w:type="dxa" w:w="680"/>
           </w:tcPr>
           <w:p>
             <w:r/>
@@ -1899,7 +1957,20 @@
         </w:tc>
         <w:tc>
           <w:tcPr>
-            <w:tcW w:type="dxa" w:w="754"/>
+            <w:tcW w:type="dxa" w:w="680"/>
+          </w:tcPr>
+          <w:p>
+            <w:r/>
+            <w:r>
+              <w:rPr>
+                <w:sz w:val="18"/>
+              </w:rPr>
+            </w:r>
+          </w:p>
+        </w:tc>
+        <w:tc>
+          <w:tcPr>
+            <w:tcW w:type="dxa" w:w="680"/>
           </w:tcPr>
           <w:p>
             <w:r/>
@@ -1927,7 +1998,7 @@
         </w:tc>
         <w:tc>
           <w:tcPr>
-            <w:tcW w:type="dxa" w:w="3061"/>
+            <w:tcW w:type="dxa" w:w="2835"/>
           </w:tcPr>
           <w:p>
             <w:r/>
@@ -1941,7 +2012,7 @@
         </w:tc>
         <w:tc>
           <w:tcPr>
-            <w:tcW w:type="dxa" w:w="754"/>
+            <w:tcW w:type="dxa" w:w="680"/>
           </w:tcPr>
           <w:p>
             <w:r/>
@@ -1954,7 +2025,7 @@
         </w:tc>
         <w:tc>
           <w:tcPr>
-            <w:tcW w:type="dxa" w:w="754"/>
+            <w:tcW w:type="dxa" w:w="680"/>
           </w:tcPr>
           <w:p>
             <w:r/>
@@ -1967,7 +2038,7 @@
         </w:tc>
         <w:tc>
           <w:tcPr>
-            <w:tcW w:type="dxa" w:w="754"/>
+            <w:tcW w:type="dxa" w:w="680"/>
             <w:shd w:val="clear" w:fill="404040"/>
           </w:tcPr>
           <w:p>
@@ -1981,7 +2052,7 @@
         </w:tc>
         <w:tc>
           <w:tcPr>
-            <w:tcW w:type="dxa" w:w="754"/>
+            <w:tcW w:type="dxa" w:w="680"/>
             <w:shd w:val="clear" w:fill="404040"/>
           </w:tcPr>
           <w:p>
@@ -1995,7 +2066,7 @@
         </w:tc>
         <w:tc>
           <w:tcPr>
-            <w:tcW w:type="dxa" w:w="754"/>
+            <w:tcW w:type="dxa" w:w="680"/>
           </w:tcPr>
           <w:p>
             <w:r/>
@@ -2008,7 +2079,20 @@
         </w:tc>
         <w:tc>
           <w:tcPr>
-            <w:tcW w:type="dxa" w:w="754"/>
+            <w:tcW w:type="dxa" w:w="680"/>
+          </w:tcPr>
+          <w:p>
+            <w:r/>
+            <w:r>
+              <w:rPr>
+                <w:sz w:val="18"/>
+              </w:rPr>
+            </w:r>
+          </w:p>
+        </w:tc>
+        <w:tc>
+          <w:tcPr>
+            <w:tcW w:type="dxa" w:w="680"/>
           </w:tcPr>
           <w:p>
             <w:r/>
@@ -2036,7 +2120,7 @@
         </w:tc>
         <w:tc>
           <w:tcPr>
-            <w:tcW w:type="dxa" w:w="3061"/>
+            <w:tcW w:type="dxa" w:w="2835"/>
           </w:tcPr>
           <w:p>
             <w:r/>
@@ -2050,7 +2134,7 @@
         </w:tc>
         <w:tc>
           <w:tcPr>
-            <w:tcW w:type="dxa" w:w="754"/>
+            <w:tcW w:type="dxa" w:w="680"/>
           </w:tcPr>
           <w:p>
             <w:r/>
@@ -2063,7 +2147,7 @@
         </w:tc>
         <w:tc>
           <w:tcPr>
-            <w:tcW w:type="dxa" w:w="754"/>
+            <w:tcW w:type="dxa" w:w="680"/>
           </w:tcPr>
           <w:p>
             <w:r/>
@@ -2076,7 +2160,7 @@
         </w:tc>
         <w:tc>
           <w:tcPr>
-            <w:tcW w:type="dxa" w:w="754"/>
+            <w:tcW w:type="dxa" w:w="680"/>
           </w:tcPr>
           <w:p>
             <w:r/>
@@ -2089,7 +2173,7 @@
         </w:tc>
         <w:tc>
           <w:tcPr>
-            <w:tcW w:type="dxa" w:w="754"/>
+            <w:tcW w:type="dxa" w:w="680"/>
             <w:shd w:val="clear" w:fill="404040"/>
           </w:tcPr>
           <w:p>
@@ -2103,7 +2187,7 @@
         </w:tc>
         <w:tc>
           <w:tcPr>
-            <w:tcW w:type="dxa" w:w="754"/>
+            <w:tcW w:type="dxa" w:w="680"/>
           </w:tcPr>
           <w:p>
             <w:r/>
@@ -2116,7 +2200,20 @@
         </w:tc>
         <w:tc>
           <w:tcPr>
-            <w:tcW w:type="dxa" w:w="754"/>
+            <w:tcW w:type="dxa" w:w="680"/>
+          </w:tcPr>
+          <w:p>
+            <w:r/>
+            <w:r>
+              <w:rPr>
+                <w:sz w:val="18"/>
+              </w:rPr>
+            </w:r>
+          </w:p>
+        </w:tc>
+        <w:tc>
+          <w:tcPr>
+            <w:tcW w:type="dxa" w:w="680"/>
           </w:tcPr>
           <w:p>
             <w:r/>
@@ -2145,7 +2242,7 @@
         </w:tc>
         <w:tc>
           <w:tcPr>
-            <w:tcW w:type="dxa" w:w="3061"/>
+            <w:tcW w:type="dxa" w:w="2835"/>
           </w:tcPr>
           <w:p>
             <w:r/>
@@ -2159,7 +2256,7 @@
         </w:tc>
         <w:tc>
           <w:tcPr>
-            <w:tcW w:type="dxa" w:w="754"/>
+            <w:tcW w:type="dxa" w:w="680"/>
           </w:tcPr>
           <w:p>
             <w:r/>
@@ -2172,7 +2269,7 @@
         </w:tc>
         <w:tc>
           <w:tcPr>
-            <w:tcW w:type="dxa" w:w="754"/>
+            <w:tcW w:type="dxa" w:w="680"/>
           </w:tcPr>
           <w:p>
             <w:r/>
@@ -2185,7 +2282,7 @@
         </w:tc>
         <w:tc>
           <w:tcPr>
-            <w:tcW w:type="dxa" w:w="754"/>
+            <w:tcW w:type="dxa" w:w="680"/>
           </w:tcPr>
           <w:p>
             <w:r/>
@@ -2198,7 +2295,7 @@
         </w:tc>
         <w:tc>
           <w:tcPr>
-            <w:tcW w:type="dxa" w:w="754"/>
+            <w:tcW w:type="dxa" w:w="680"/>
             <w:shd w:val="clear" w:fill="404040"/>
           </w:tcPr>
           <w:p>
@@ -2212,7 +2309,7 @@
         </w:tc>
         <w:tc>
           <w:tcPr>
-            <w:tcW w:type="dxa" w:w="754"/>
+            <w:tcW w:type="dxa" w:w="680"/>
           </w:tcPr>
           <w:p>
             <w:r/>
@@ -2225,7 +2322,20 @@
         </w:tc>
         <w:tc>
           <w:tcPr>
-            <w:tcW w:type="dxa" w:w="754"/>
+            <w:tcW w:type="dxa" w:w="680"/>
+          </w:tcPr>
+          <w:p>
+            <w:r/>
+            <w:r>
+              <w:rPr>
+                <w:sz w:val="18"/>
+              </w:rPr>
+            </w:r>
+          </w:p>
+        </w:tc>
+        <w:tc>
+          <w:tcPr>
+            <w:tcW w:type="dxa" w:w="680"/>
           </w:tcPr>
           <w:p>
             <w:r/>
@@ -2253,7 +2363,7 @@
         </w:tc>
         <w:tc>
           <w:tcPr>
-            <w:tcW w:type="dxa" w:w="3061"/>
+            <w:tcW w:type="dxa" w:w="2835"/>
           </w:tcPr>
           <w:p>
             <w:r/>
@@ -2267,7 +2377,7 @@
         </w:tc>
         <w:tc>
           <w:tcPr>
-            <w:tcW w:type="dxa" w:w="754"/>
+            <w:tcW w:type="dxa" w:w="680"/>
           </w:tcPr>
           <w:p>
             <w:r/>
@@ -2280,7 +2390,7 @@
         </w:tc>
         <w:tc>
           <w:tcPr>
-            <w:tcW w:type="dxa" w:w="754"/>
+            <w:tcW w:type="dxa" w:w="680"/>
           </w:tcPr>
           <w:p>
             <w:r/>
@@ -2293,7 +2403,7 @@
         </w:tc>
         <w:tc>
           <w:tcPr>
-            <w:tcW w:type="dxa" w:w="754"/>
+            <w:tcW w:type="dxa" w:w="680"/>
           </w:tcPr>
           <w:p>
             <w:r/>
@@ -2306,7 +2416,7 @@
         </w:tc>
         <w:tc>
           <w:tcPr>
-            <w:tcW w:type="dxa" w:w="754"/>
+            <w:tcW w:type="dxa" w:w="680"/>
           </w:tcPr>
           <w:p>
             <w:r/>
@@ -2319,7 +2429,7 @@
         </w:tc>
         <w:tc>
           <w:tcPr>
-            <w:tcW w:type="dxa" w:w="754"/>
+            <w:tcW w:type="dxa" w:w="680"/>
             <w:shd w:val="clear" w:fill="404040"/>
           </w:tcPr>
           <w:p>
@@ -2333,7 +2443,21 @@
         </w:tc>
         <w:tc>
           <w:tcPr>
-            <w:tcW w:type="dxa" w:w="754"/>
+            <w:tcW w:type="dxa" w:w="680"/>
+            <w:shd w:val="clear" w:fill="404040"/>
+          </w:tcPr>
+          <w:p>
+            <w:r/>
+            <w:r>
+              <w:rPr>
+                <w:sz w:val="18"/>
+              </w:rPr>
+            </w:r>
+          </w:p>
+        </w:tc>
+        <w:tc>
+          <w:tcPr>
+            <w:tcW w:type="dxa" w:w="680"/>
           </w:tcPr>
           <w:p>
             <w:r/>
@@ -2362,7 +2486,7 @@
         </w:tc>
         <w:tc>
           <w:tcPr>
-            <w:tcW w:type="dxa" w:w="3061"/>
+            <w:tcW w:type="dxa" w:w="2835"/>
           </w:tcPr>
           <w:p>
             <w:r/>
@@ -2376,7 +2500,7 @@
         </w:tc>
         <w:tc>
           <w:tcPr>
-            <w:tcW w:type="dxa" w:w="754"/>
+            <w:tcW w:type="dxa" w:w="680"/>
           </w:tcPr>
           <w:p>
             <w:r/>
@@ -2389,7 +2513,7 @@
         </w:tc>
         <w:tc>
           <w:tcPr>
-            <w:tcW w:type="dxa" w:w="754"/>
+            <w:tcW w:type="dxa" w:w="680"/>
           </w:tcPr>
           <w:p>
             <w:r/>
@@ -2402,7 +2526,7 @@
         </w:tc>
         <w:tc>
           <w:tcPr>
-            <w:tcW w:type="dxa" w:w="754"/>
+            <w:tcW w:type="dxa" w:w="680"/>
           </w:tcPr>
           <w:p>
             <w:r/>
@@ -2415,7 +2539,7 @@
         </w:tc>
         <w:tc>
           <w:tcPr>
-            <w:tcW w:type="dxa" w:w="754"/>
+            <w:tcW w:type="dxa" w:w="680"/>
           </w:tcPr>
           <w:p>
             <w:r/>
@@ -2428,7 +2552,20 @@
         </w:tc>
         <w:tc>
           <w:tcPr>
-            <w:tcW w:type="dxa" w:w="754"/>
+            <w:tcW w:type="dxa" w:w="680"/>
+          </w:tcPr>
+          <w:p>
+            <w:r/>
+            <w:r>
+              <w:rPr>
+                <w:sz w:val="18"/>
+              </w:rPr>
+            </w:r>
+          </w:p>
+        </w:tc>
+        <w:tc>
+          <w:tcPr>
+            <w:tcW w:type="dxa" w:w="680"/>
             <w:shd w:val="clear" w:fill="404040"/>
           </w:tcPr>
           <w:p>
@@ -2442,7 +2579,7 @@
         </w:tc>
         <w:tc>
           <w:tcPr>
-            <w:tcW w:type="dxa" w:w="754"/>
+            <w:tcW w:type="dxa" w:w="680"/>
           </w:tcPr>
           <w:p>
             <w:r/>
@@ -2471,7 +2608,7 @@
         </w:tc>
         <w:tc>
           <w:tcPr>
-            <w:tcW w:type="dxa" w:w="3061"/>
+            <w:tcW w:type="dxa" w:w="2835"/>
           </w:tcPr>
           <w:p>
             <w:r/>
@@ -2479,13 +2616,13 @@
               <w:rPr>
                 <w:sz w:val="18"/>
               </w:rPr>
-              <w:t>Documentação final, estimativa de custos e apresentação</w:t>
+              <w:t>Documentação final, estimativa de custos e ensaio da apresentação</w:t>
             </w:r>
           </w:p>
         </w:tc>
         <w:tc>
           <w:tcPr>
-            <w:tcW w:type="dxa" w:w="754"/>
+            <w:tcW w:type="dxa" w:w="680"/>
           </w:tcPr>
           <w:p>
             <w:r/>
@@ -2498,7 +2635,7 @@
         </w:tc>
         <w:tc>
           <w:tcPr>
-            <w:tcW w:type="dxa" w:w="754"/>
+            <w:tcW w:type="dxa" w:w="680"/>
           </w:tcPr>
           <w:p>
             <w:r/>
@@ -2511,7 +2648,7 @@
         </w:tc>
         <w:tc>
           <w:tcPr>
-            <w:tcW w:type="dxa" w:w="754"/>
+            <w:tcW w:type="dxa" w:w="680"/>
           </w:tcPr>
           <w:p>
             <w:r/>
@@ -2524,7 +2661,7 @@
         </w:tc>
         <w:tc>
           <w:tcPr>
-            <w:tcW w:type="dxa" w:w="754"/>
+            <w:tcW w:type="dxa" w:w="680"/>
           </w:tcPr>
           <w:p>
             <w:r/>
@@ -2537,7 +2674,20 @@
         </w:tc>
         <w:tc>
           <w:tcPr>
-            <w:tcW w:type="dxa" w:w="754"/>
+            <w:tcW w:type="dxa" w:w="680"/>
+          </w:tcPr>
+          <w:p>
+            <w:r/>
+            <w:r>
+              <w:rPr>
+                <w:sz w:val="18"/>
+              </w:rPr>
+            </w:r>
+          </w:p>
+        </w:tc>
+        <w:tc>
+          <w:tcPr>
+            <w:tcW w:type="dxa" w:w="680"/>
             <w:shd w:val="clear" w:fill="404040"/>
           </w:tcPr>
           <w:p>
@@ -2551,7 +2701,7 @@
         </w:tc>
         <w:tc>
           <w:tcPr>
-            <w:tcW w:type="dxa" w:w="754"/>
+            <w:tcW w:type="dxa" w:w="680"/>
             <w:shd w:val="clear" w:fill="404040"/>
           </w:tcPr>
           <w:p>
@@ -2565,6 +2715,30 @@
         </w:tc>
       </w:tr>
     </w:tbl>
+    <w:p>
+      <w:pPr>
+        <w:spacing w:line="360" w:lineRule="auto" w:after="80"/>
+        <w:ind w:firstLine="709"/>
+        <w:jc w:val="both"/>
+      </w:pPr>
+      <w:r>
+        <w:rPr>
+          <w:b w:val="0"/>
+        </w:rPr>
+      </w:r>
+    </w:p>
+    <w:p>
+      <w:pPr>
+        <w:spacing w:line="360" w:lineRule="auto" w:after="160"/>
+        <w:jc w:val="both"/>
+      </w:pPr>
+      <w:r>
+        <w:rPr>
+          <w:b w:val="0"/>
+        </w:rPr>
+        <w:t>Observação: todas as atividades terminam até 20/11/2026 (sexta-feira). O dia 21/11 fica como reserva para imprevistos, e o dia 22/11 (prazo até as 23:59) é reservado exclusivamente para o envio da entrega final.</w:t>
+      </w:r>
+    </w:p>
     <w:sectPr>
       <w:pgSz w:w="11906" w:h="16838"/>
       <w:pgMar w:top="1701" w:right="1134" w:bottom="1134" w:left="1701" w:header="720" w:footer="720" w:gutter="0"/>

</xml_diff>

<commit_message>
Reword client scenario from distributor to warehouse
Co-Authored-By: Claude Sonnet 5.5 <noreply@anthropic.com>
Claude-Session: https://claude.ai/code/session_01Cb9JCnkxhYN3njs8QxNxcM
</commit_message>
<xml_diff>
--- a/docs/entrega-parcial.docx
+++ b/docs/entrega-parcial.docx
@@ -375,7 +375,7 @@
         <w:rPr>
           <w:b w:val="0"/>
         </w:rPr>
-        <w:t>Empresas de distribuição de médio porte ainda controlam o estoque em planilhas eletrônicas. Esse modelo gera divergência de saldo, ausência de histórico confiável das movimentações, ruptura de produtos por falta de alertas e dificuldade de trabalho simultâneo entre vários usuários.</w:t>
+        <w:t>Armazéns de médio porte, de qualquer tipo de produto, ainda controlam o estoque em planilhas eletrônicas. Esse modelo gera divergência de saldo, ausência de histórico confiável das movimentações, ruptura de produtos por falta de alertas e dificuldade de trabalho simultâneo entre vários usuários.</w:t>
       </w:r>
     </w:p>
     <w:p>
@@ -425,7 +425,7 @@
         <w:rPr>
           <w:b w:val="0"/>
         </w:rPr>
-        <w:t>O cenário de negócio adotado é o de uma distribuidora de médio porte, com 2.000 a 3.000 itens (SKUs), cerca de 30 usuários simultâneos e picos de acesso no início e no fim do expediente. Atualmente, o controle é feito em planilhas Excel, que serão migradas para o sistema na nuvem.</w:t>
+        <w:t>O cenário de negócio adotado é o de um armazém de médio porte, com 2.000 a 3.000 itens (SKUs), cerca de 30 usuários simultâneos e picos de acesso no início e no fim do expediente. Atualmente, o controle é feito em planilhas Excel, que serão migradas para o sistema na nuvem.</w:t>
       </w:r>
     </w:p>
     <w:p>

</xml_diff>